<commit_message>
Technical report: add image tag v2.1 to section 7.7
</commit_message>
<xml_diff>
--- a/docs/CPS_Testbed_Technical_Report_v2.docx
+++ b/docs/CPS_Testbed_Technical_Report_v2.docx
@@ -10275,7 +10275,7 @@
           <w:sz w:val="24"/>
           <w:szCs w:val="24"/>
         </w:rPr>
-        <w:t xml:space="preserve">The complete testbed is packaged as a public container image at ghcr.io/mazharulmd/cps-testbed, and the source code, bus-system cases and build files are in the GitHub repository github.com/mazharulmd/cps-testbed. Three image tags are published:</w:t>
+        <w:t xml:space="preserve">The complete testbed is packaged as a public container image at ghcr.io/mazharulmd/cps-testbed, and the source code, bus-system cases and build files are in the GitHub repository github.com/mazharulmd/cps-testbed. Four image tags are published:</w:t>
       </w:r>
     </w:p>
     <w:p>
@@ -10325,6 +10325,35 @@
           <w:sz w:val="24"/>
           <w:szCs w:val="24"/>
         </w:rPr>
+        <w:t xml:space="preserve">v2.1:</w:t>
+      </w:r>
+      <w:r>
+        <w:rPr>
+          <w:rFonts w:ascii="Times New Roman" w:hAnsi="Times New Roman" w:cs="Times New Roman"/>
+          <w:sz w:val="24"/>
+          <w:szCs w:val="24"/>
+        </w:rPr>
+        <w:t xml:space="preserve"> the current release under a fixed name. It runs the same simulation code as v2 and adds the redesigned web application (project header, colour-coded results, phone layout), validation of event and attack buses against the chosen bus system, and automatic opening of finished runs.</w:t>
+      </w:r>
+    </w:p>
+    <w:p>
+      <w:pPr>
+        <w:spacing w:after="120" w:line="276" w:lineRule="auto"/>
+        <w:jc w:val="both"/>
+        <w:rPr>
+          <w:rFonts w:ascii="Times New Roman" w:hAnsi="Times New Roman" w:cs="Times New Roman"/>
+          <w:sz w:val="24"/>
+          <w:szCs w:val="24"/>
+        </w:rPr>
+      </w:pPr>
+      <w:r>
+        <w:rPr>
+          <w:rFonts w:ascii="Times New Roman" w:hAnsi="Times New Roman" w:cs="Times New Roman"/>
+          <w:b/>
+          <w:bCs/>
+          <w:sz w:val="24"/>
+          <w:szCs w:val="24"/>
+        </w:rPr>
         <w:t xml:space="preserve">v2:</w:t>
       </w:r>
       <w:r>
@@ -10333,7 +10362,7 @@
           <w:sz w:val="24"/>
           <w:szCs w:val="24"/>
         </w:rPr>
-        <w:t xml:space="preserve"> the same image at the multi-PMU release, under a fixed name that does not change when latest is updated. All results in Section 8 were produced with this version, so it should be used to reproduce them.</w:t>
+        <w:t xml:space="preserve"> the multi-PMU release under a fixed name that does not change when latest is updated. All results in Section 8 were produced with this version, so it should be used to reproduce them.</w:t>
       </w:r>
     </w:p>
     <w:p>

</xml_diff>